<commit_message>
refactor(shortest_paths_algorithms): rename A* heuristic labels to A*_x, add extracted_nodes_graph toggles
- algorithms_comparison.py: rename the "A* (h_geo)"/"A* (h_bcn)"/"A* (h_cheat)"
  legend labels to "A*_geo"/"A*_bcn"/"A*_cheat"
- extracted_nodes_graph.py: propagate the same renaming to its own legend
  text, filename tag, and output filename. Add SHOW_H_BCN and SHOW_BRIDGE
  toggle constants to include/exclude h_bcn's run and the branch-bridge
  diamond from the figure, and print the optimum weight (via
  with_adjusted_target_weight, same as the reports) in the path sidebar
- README.md: document h_bcn's formula and update it for the A*_x renaming
</commit_message>
<xml_diff>
--- a/.docu/Algoritmes per trobar una ruta òptima/Anàlisi/Comparació de nodes extrets.docx
+++ b/.docu/Algoritmes per trobar una ruta òptima/Anàlisi/Comparació de nodes extrets.docx
@@ -39,6 +39,75 @@
         <w:t xml:space="preserve"> per posar d’exemple en aquests gràfics els quatre algoritmes han trobat el mateix shortest path. </w:t>
       </w:r>
     </w:p>
+    <w:p>
+      <w:pPr>
+        <w:rPr>
+          <w:rFonts w:ascii="Arial" w:hAnsi="Arial" w:cs="Arial"/>
+        </w:rPr>
+      </w:pPr>
+      <w:r>
+        <w:rPr>
+          <w:rFonts w:ascii="Arial" w:hAnsi="Arial" w:cs="Arial"/>
+        </w:rPr>
+        <w:t>Recordem que el nombre d’iteracions només és igual al nombre de vèrtexs extrets si l’heurísitca és consistent (amb el Dijkstra ho tenim assegurat). Osigui que que el nombre d’iteracions sigui un i després veiem que hi ha menys nodes extrets tém sentit i no és una inconsistència.</w:t>
+      </w:r>
+    </w:p>
+    <w:p>
+      <w:pPr>
+        <w:rPr>
+          <w:rFonts w:ascii="Arial" w:hAnsi="Arial" w:cs="Arial"/>
+        </w:rPr>
+      </w:pPr>
+    </w:p>
+    <w:p>
+      <w:pPr>
+        <w:rPr>
+          <w:rFonts w:ascii="Arial" w:hAnsi="Arial" w:cs="Arial"/>
+        </w:rPr>
+      </w:pPr>
+      <w:r>
+        <w:rPr>
+          <w:rFonts w:ascii="Arial" w:hAnsi="Arial" w:cs="Arial"/>
+        </w:rPr>
+        <w:t>Exemples a ensenyar:</w:t>
+      </w:r>
+    </w:p>
+    <w:p>
+      <w:pPr>
+        <w:pStyle w:val="ListParagraph"/>
+        <w:numPr>
+          <w:ilvl w:val="0"/>
+          <w:numId w:val="1"/>
+        </w:numPr>
+        <w:rPr>
+          <w:rFonts w:ascii="Arial" w:hAnsi="Arial" w:cs="Arial"/>
+        </w:rPr>
+      </w:pPr>
+      <w:r>
+        <w:rPr>
+          <w:rFonts w:ascii="Arial" w:hAnsi="Arial" w:cs="Arial"/>
+        </w:rPr>
+        <w:t>Un en el què h_cheat no sigui 1 (això evidentment inclòs en un exemple d’un cas)</w:t>
+      </w:r>
+    </w:p>
+    <w:p>
+      <w:pPr>
+        <w:pStyle w:val="ListParagraph"/>
+        <w:numPr>
+          <w:ilvl w:val="0"/>
+          <w:numId w:val="1"/>
+        </w:numPr>
+        <w:rPr>
+          <w:rFonts w:ascii="Arial" w:hAnsi="Arial" w:cs="Arial"/>
+        </w:rPr>
+      </w:pPr>
+      <w:r>
+        <w:rPr>
+          <w:rFonts w:ascii="Arial" w:hAnsi="Arial" w:cs="Arial"/>
+        </w:rPr>
+        <w:t>Un en el que es vegi com millora el Dijkstra amb full graph vs cut-graph, per exemple a SB</w:t>
+      </w:r>
+    </w:p>
     <w:sectPr>
       <w:pgSz w:w="11906" w:h="16838"/>
       <w:pgMar w:top="1440" w:right="1440" w:bottom="1440" w:left="1440" w:header="708" w:footer="708" w:gutter="0"/>
@@ -47,6 +116,126 @@
     </w:sectPr>
   </w:body>
 </w:document>
+</file>
+
+<file path=word/numbering.xml><?xml version="1.0" encoding="utf-8"?>
+<w:numbering xmlns:wpc="http://schemas.microsoft.com/office/word/2010/wordprocessingCanvas" xmlns:cx="http://schemas.microsoft.com/office/drawing/2014/chartex" xmlns:cx1="http://schemas.microsoft.com/office/drawing/2015/9/8/chartex" xmlns:cx2="http://schemas.microsoft.com/office/drawing/2015/10/21/chartex" xmlns:cx3="http://schemas.microsoft.com/office/drawing/2016/5/9/chartex" xmlns:cx4="http://schemas.microsoft.com/office/drawing/2016/5/10/chartex" xmlns:cx5="http://schemas.microsoft.com/office/drawing/2016/5/11/chartex" xmlns:cx6="http://schemas.microsoft.com/office/drawing/2016/5/12/chartex" xmlns:cx7="http://schemas.microsoft.com/office/drawing/2016/5/13/chartex" xmlns:cx8="http://schemas.microsoft.com/office/drawing/2016/5/14/chartex" xmlns:mc="http://schemas.openxmlformats.org/markup-compatibility/2006" xmlns:m="http://schemas.openxmlformats.org/officeDocument/2006/math" xmlns:aink="http://schemas.microsoft.com/office/drawing/2016/ink" xmlns:am3d="http://schemas.microsoft.com/office/drawing/2017/model3d" xmlns:oel="http://schemas.microsoft.com/office/2019/extlst" xmlns:r="http://schemas.openxmlformats.org/officeDocument/2006/relationships" xmlns:wp14="http://schemas.microsoft.com/office/word/2010/wordprocessingDrawing" xmlns:wp="http://schemas.openxmlformats.org/drawingml/2006/wordprocessingDrawing" xmlns:wpg="http://schemas.microsoft.com/office/word/2010/wordprocessingGroup" xmlns:wpi="http://schemas.microsoft.com/office/word/2010/wordprocessingInk" xmlns:wps="http://schemas.microsoft.com/office/word/2010/wordprocessingShape" xmlns:o="urn:schemas-microsoft-com:office:office" xmlns:v="urn:schemas-microsoft-com:vml" xmlns:w10="urn:schemas-microsoft-com:office:word" xmlns:w="http://schemas.openxmlformats.org/wordprocessingml/2006/main" xmlns:w14="http://schemas.microsoft.com/office/word/2010/wordml" xmlns:w15="http://schemas.microsoft.com/office/word/2012/wordml" xmlns:w16cex="http://schemas.microsoft.com/office/word/2018/wordml/cex" xmlns:w16cid="http://schemas.microsoft.com/office/word/2016/wordml/cid" xmlns:w16="http://schemas.microsoft.com/office/word/2018/wordml" xmlns:w16sdtdh="http://schemas.microsoft.com/office/word/2020/wordml/sdtdatahash" xmlns:w16sdtfl="http://schemas.microsoft.com/office/word/2024/wordml/sdtformatlock" xmlns:w16se="http://schemas.microsoft.com/office/word/2015/wordml/symex" xmlns:w16du="http://schemas.microsoft.com/office/word/2023/wordml/word16du" xmlns:wne="http://schemas.microsoft.com/office/word/2006/wordml" mc:Ignorable="w14 w15 w16se w16cid w16 w16cex w16sdtdh w16sdtfl w16du wp14">
+  <w:abstractNum w:abstractNumId="0" w15:restartNumberingAfterBreak="0">
+    <w:nsid w:val="09E0197D"/>
+    <w:multiLevelType w:val="hybridMultilevel"/>
+    <w:tmpl w:val="A718EA56"/>
+    <w:lvl w:ilvl="0" w:tplc="449CA14E">
+      <w:numFmt w:val="bullet"/>
+      <w:lvlText w:val="-"/>
+      <w:lvlJc w:val="left"/>
+      <w:pPr>
+        <w:ind w:left="720" w:hanging="360"/>
+      </w:pPr>
+      <w:rPr>
+        <w:rFonts w:ascii="Arial" w:eastAsiaTheme="minorHAnsi" w:hAnsi="Arial" w:cs="Arial" w:hint="default"/>
+      </w:rPr>
+    </w:lvl>
+    <w:lvl w:ilvl="1" w:tplc="08090003" w:tentative="1">
+      <w:start w:val="1"/>
+      <w:numFmt w:val="bullet"/>
+      <w:lvlText w:val="o"/>
+      <w:lvlJc w:val="left"/>
+      <w:pPr>
+        <w:ind w:left="1440" w:hanging="360"/>
+      </w:pPr>
+      <w:rPr>
+        <w:rFonts w:ascii="Courier New" w:hAnsi="Courier New" w:cs="Courier New" w:hint="default"/>
+      </w:rPr>
+    </w:lvl>
+    <w:lvl w:ilvl="2" w:tplc="08090005" w:tentative="1">
+      <w:start w:val="1"/>
+      <w:numFmt w:val="bullet"/>
+      <w:lvlText w:val=""/>
+      <w:lvlJc w:val="left"/>
+      <w:pPr>
+        <w:ind w:left="2160" w:hanging="360"/>
+      </w:pPr>
+      <w:rPr>
+        <w:rFonts w:ascii="Wingdings" w:hAnsi="Wingdings" w:hint="default"/>
+      </w:rPr>
+    </w:lvl>
+    <w:lvl w:ilvl="3" w:tplc="08090001" w:tentative="1">
+      <w:start w:val="1"/>
+      <w:numFmt w:val="bullet"/>
+      <w:lvlText w:val=""/>
+      <w:lvlJc w:val="left"/>
+      <w:pPr>
+        <w:ind w:left="2880" w:hanging="360"/>
+      </w:pPr>
+      <w:rPr>
+        <w:rFonts w:ascii="Symbol" w:hAnsi="Symbol" w:hint="default"/>
+      </w:rPr>
+    </w:lvl>
+    <w:lvl w:ilvl="4" w:tplc="08090003" w:tentative="1">
+      <w:start w:val="1"/>
+      <w:numFmt w:val="bullet"/>
+      <w:lvlText w:val="o"/>
+      <w:lvlJc w:val="left"/>
+      <w:pPr>
+        <w:ind w:left="3600" w:hanging="360"/>
+      </w:pPr>
+      <w:rPr>
+        <w:rFonts w:ascii="Courier New" w:hAnsi="Courier New" w:cs="Courier New" w:hint="default"/>
+      </w:rPr>
+    </w:lvl>
+    <w:lvl w:ilvl="5" w:tplc="08090005" w:tentative="1">
+      <w:start w:val="1"/>
+      <w:numFmt w:val="bullet"/>
+      <w:lvlText w:val=""/>
+      <w:lvlJc w:val="left"/>
+      <w:pPr>
+        <w:ind w:left="4320" w:hanging="360"/>
+      </w:pPr>
+      <w:rPr>
+        <w:rFonts w:ascii="Wingdings" w:hAnsi="Wingdings" w:hint="default"/>
+      </w:rPr>
+    </w:lvl>
+    <w:lvl w:ilvl="6" w:tplc="08090001" w:tentative="1">
+      <w:start w:val="1"/>
+      <w:numFmt w:val="bullet"/>
+      <w:lvlText w:val=""/>
+      <w:lvlJc w:val="left"/>
+      <w:pPr>
+        <w:ind w:left="5040" w:hanging="360"/>
+      </w:pPr>
+      <w:rPr>
+        <w:rFonts w:ascii="Symbol" w:hAnsi="Symbol" w:hint="default"/>
+      </w:rPr>
+    </w:lvl>
+    <w:lvl w:ilvl="7" w:tplc="08090003" w:tentative="1">
+      <w:start w:val="1"/>
+      <w:numFmt w:val="bullet"/>
+      <w:lvlText w:val="o"/>
+      <w:lvlJc w:val="left"/>
+      <w:pPr>
+        <w:ind w:left="5760" w:hanging="360"/>
+      </w:pPr>
+      <w:rPr>
+        <w:rFonts w:ascii="Courier New" w:hAnsi="Courier New" w:cs="Courier New" w:hint="default"/>
+      </w:rPr>
+    </w:lvl>
+    <w:lvl w:ilvl="8" w:tplc="08090005" w:tentative="1">
+      <w:start w:val="1"/>
+      <w:numFmt w:val="bullet"/>
+      <w:lvlText w:val=""/>
+      <w:lvlJc w:val="left"/>
+      <w:pPr>
+        <w:ind w:left="6480" w:hanging="360"/>
+      </w:pPr>
+      <w:rPr>
+        <w:rFonts w:ascii="Wingdings" w:hAnsi="Wingdings" w:hint="default"/>
+      </w:rPr>
+    </w:lvl>
+  </w:abstractNum>
+  <w:num w:numId="1" w16cid:durableId="1214777131">
+    <w:abstractNumId w:val="0"/>
+  </w:num>
+</w:numbering>
 </file>
 
 <file path=word/styles.xml><?xml version="1.0" encoding="utf-8"?>

</xml_diff>